<commit_message>
Auto update weekly strength plan and articles
</commit_message>
<xml_diff>
--- a/docs/weekly/2026-W32_當週鐵人新知與文章整理_中文版.docx
+++ b/docs/weekly/2026-W32_當週鐵人新知與文章整理_中文版.docx
@@ -27,7 +27,7 @@
           <w:color w:val="555555"/>
           <w:sz w:val="19"/>
         </w:rPr>
-        <w:t>彙整時間：2026-08-03 09:04:08　｜　時間範圍：過去 7 天</w:t>
+        <w:t>彙整時間：2026-08-03 12:00:10　｜　時間範圍：過去 7 天</w:t>
         <w:br/>
         <w:t>來源網站：Slowtwitch, Triathlete, 220 Triathlon, TrainingPeaks, Joe Friel (已翻譯為繁體中文)</w:t>
       </w:r>
@@ -176,7 +176,7 @@
             <w:rFonts w:ascii="Calibri" w:hAnsi="Calibri" w:eastAsia="Microsoft JhengHei"/>
             <w:sz w:val="22"/>
           </w:rPr>
-          <w:t>鐵人三項裝備回顧：2026 年 7 月編輯精選</w:t>
+          <w:t>鐵人三項裝備回顧：2026 年 7 月編輯推薦</w:t>
         </w:r>
       </w:hyperlink>
     </w:p>
@@ -2162,7 +2162,7 @@
           <w:color w:val="333333"/>
           <w:sz w:val="19"/>
         </w:rPr>
-        <w:t>1. 從菁英運動員到運動員運動員，足底筋膜炎都讓跑者望而卻步；</w:t>
+        <w:t>1. 從菁英運動員到運動員運動員，足底筋膜炎都讓跑者望而步；</w:t>
       </w:r>
     </w:p>
     <w:p>
@@ -4004,7 +4004,7 @@
           <w:color w:val="333333"/>
           <w:sz w:val="20"/>
         </w:rPr>
-        <w:t>鐵人三項裝備回顧：2026 年 7 月編輯精選</w:t>
+        <w:t>鐵人三項裝備回顧：2026 年 7 月編輯推薦</w:t>
       </w:r>
       <w:r>
         <w:rPr>

</xml_diff>